<commit_message>
Jude: full meaning audit 2026-09-23 — 2 KO fixes (1:8 dirty sex, 1:22-23), gates 1-8 PASS, 0 split candidates
</commit_message>
<xml_diff>
--- a/gdocs_build/Jude.docx
+++ b/gdocs_build/Jude.docx
@@ -486,7 +486,7 @@
               <w:rPr>
                 <w:sz w:val="18"/>
               </w:rPr>
-              <w:t>최근에 들어온 이 침입자들이 돌리는 프로그램도 똑같아. 더러운 짓, 규칙도 리더도 다 무시, 영광스러운 건 진흙탕에 처박기.</w:t>
+              <w:t>최근에 들어온 이 침입자들이 돌리는 프로그램도 똑같아. 더러운 성관계, 규칙도 리더도 다 무시, 영광스러운 건 진흙탕에 처박기.</w:t>
             </w:r>
           </w:p>
         </w:tc>
@@ -912,7 +912,7 @@
               <w:rPr>
                 <w:sz w:val="18"/>
               </w:rPr>
-              <w:t>믿음이 흔들리는 사람들에겐 부드럽게 대해줘. 잘못된 길로 간 사람들은 찾아가서 데려와. 죄 지은 사람에겐 따뜻하게 대해주되, 죄 자체에겐 물러서지 마 — 죄 자체가 하늘까지 악취를 풍기거든.</w:t>
+              <w:t>믿음이 흔들리는 사람들에겐 부드럽게 대해줘. 잘못된 길로 간 사람들은 찾아가. 죄 지은 사람에겐 따뜻하게 대해주되, 죄 자체에겐 물러서지 마 — 죄 자체가 하늘까지 악취를 풍기거든.</w:t>
             </w:r>
           </w:p>
         </w:tc>

</xml_diff>